<commit_message>
Add Accounting network topology diagram; embed topology diagrams in both Baseline Solution Designs
- new Accounting single-AZ topology diagram (.drawio + .svg), matching the existing YAT diagram conventions (internal ALB, egress-only IGW, staff over the campus VPN, RDS for SQL Server)
- regenerated LMS + Accounting Solution Design docx/PDF with the network topology diagram embedded in section 4.4

Co-Authored-By: Claude Opus 4.8 (1M context) <noreply@anthropic.com>
</commit_message>
<xml_diff>
--- a/public/documents/YAT-Accounting-Baseline-Solution-Design.docx
+++ b/public/documents/YAT-Accounting-Baseline-Solution-Design.docx
@@ -378,7 +378,7 @@
       <w:pPr>
         <w:pStyle w:val="Heading1"/>
       </w:pPr>
-      <w:bookmarkStart w:id="0" w:name="_Toc231300399"/>
+      <w:bookmarkStart w:id="0" w:name="_Toc231381883"/>
       <w:r>
         <w:lastRenderedPageBreak/>
         <w:t>Contents</w:t>
@@ -404,7 +404,7 @@
       <w:r>
         <w:fldChar w:fldCharType="separate"/>
       </w:r>
-      <w:hyperlink w:anchor="_Toc231300399" w:history="1">
+      <w:hyperlink w:anchor="_Toc231381883" w:history="1">
         <w:r>
           <w:rPr>
             <w:rStyle w:val="Hyperlink"/>
@@ -431,7 +431,7 @@
             <w:noProof/>
             <w:webHidden/>
           </w:rPr>
-          <w:instrText xml:space="preserve"> PAGEREF _Toc231300399 \h </w:instrText>
+          <w:instrText xml:space="preserve"> PAGEREF _Toc231381883 \h </w:instrText>
         </w:r>
         <w:r>
           <w:rPr>
@@ -472,7 +472,7 @@
           <w:noProof/>
         </w:rPr>
       </w:pPr>
-      <w:hyperlink w:anchor="_Toc231300400" w:history="1">
+      <w:hyperlink w:anchor="_Toc231381884" w:history="1">
         <w:r>
           <w:rPr>
             <w:rStyle w:val="Hyperlink"/>
@@ -499,7 +499,7 @@
             <w:noProof/>
             <w:webHidden/>
           </w:rPr>
-          <w:instrText xml:space="preserve"> PAGEREF _Toc231300400 \h </w:instrText>
+          <w:instrText xml:space="preserve"> PAGEREF _Toc231381884 \h </w:instrText>
         </w:r>
         <w:r>
           <w:rPr>
@@ -540,7 +540,7 @@
           <w:noProof/>
         </w:rPr>
       </w:pPr>
-      <w:hyperlink w:anchor="_Toc231300401" w:history="1">
+      <w:hyperlink w:anchor="_Toc231381885" w:history="1">
         <w:r>
           <w:rPr>
             <w:rStyle w:val="Hyperlink"/>
@@ -567,7 +567,7 @@
             <w:noProof/>
             <w:webHidden/>
           </w:rPr>
-          <w:instrText xml:space="preserve"> PAGEREF _Toc231300401 \h </w:instrText>
+          <w:instrText xml:space="preserve"> PAGEREF _Toc231381885 \h </w:instrText>
         </w:r>
         <w:r>
           <w:rPr>
@@ -608,7 +608,7 @@
           <w:noProof/>
         </w:rPr>
       </w:pPr>
-      <w:hyperlink w:anchor="_Toc231300402" w:history="1">
+      <w:hyperlink w:anchor="_Toc231381886" w:history="1">
         <w:r>
           <w:rPr>
             <w:rStyle w:val="Hyperlink"/>
@@ -635,7 +635,7 @@
             <w:noProof/>
             <w:webHidden/>
           </w:rPr>
-          <w:instrText xml:space="preserve"> PAGEREF _Toc231300402 \h </w:instrText>
+          <w:instrText xml:space="preserve"> PAGEREF _Toc231381886 \h </w:instrText>
         </w:r>
         <w:r>
           <w:rPr>
@@ -676,7 +676,7 @@
           <w:noProof/>
         </w:rPr>
       </w:pPr>
-      <w:hyperlink w:anchor="_Toc231300403" w:history="1">
+      <w:hyperlink w:anchor="_Toc231381887" w:history="1">
         <w:r>
           <w:rPr>
             <w:rStyle w:val="Hyperlink"/>
@@ -703,7 +703,7 @@
             <w:noProof/>
             <w:webHidden/>
           </w:rPr>
-          <w:instrText xml:space="preserve"> PAGEREF _Toc231300403 \h </w:instrText>
+          <w:instrText xml:space="preserve"> PAGEREF _Toc231381887 \h </w:instrText>
         </w:r>
         <w:r>
           <w:rPr>
@@ -744,7 +744,7 @@
           <w:noProof/>
         </w:rPr>
       </w:pPr>
-      <w:hyperlink w:anchor="_Toc231300404" w:history="1">
+      <w:hyperlink w:anchor="_Toc231381888" w:history="1">
         <w:r>
           <w:rPr>
             <w:rStyle w:val="Hyperlink"/>
@@ -771,7 +771,7 @@
             <w:noProof/>
             <w:webHidden/>
           </w:rPr>
-          <w:instrText xml:space="preserve"> PAGEREF _Toc231300404 \h </w:instrText>
+          <w:instrText xml:space="preserve"> PAGEREF _Toc231381888 \h </w:instrText>
         </w:r>
         <w:r>
           <w:rPr>
@@ -812,7 +812,7 @@
           <w:noProof/>
         </w:rPr>
       </w:pPr>
-      <w:hyperlink w:anchor="_Toc231300405" w:history="1">
+      <w:hyperlink w:anchor="_Toc231381889" w:history="1">
         <w:r>
           <w:rPr>
             <w:rStyle w:val="Hyperlink"/>
@@ -839,7 +839,7 @@
             <w:noProof/>
             <w:webHidden/>
           </w:rPr>
-          <w:instrText xml:space="preserve"> PAGEREF _Toc231300405 \h </w:instrText>
+          <w:instrText xml:space="preserve"> PAGEREF _Toc231381889 \h </w:instrText>
         </w:r>
         <w:r>
           <w:rPr>
@@ -880,7 +880,7 @@
           <w:noProof/>
         </w:rPr>
       </w:pPr>
-      <w:hyperlink w:anchor="_Toc231300406" w:history="1">
+      <w:hyperlink w:anchor="_Toc231381890" w:history="1">
         <w:r>
           <w:rPr>
             <w:rStyle w:val="Hyperlink"/>
@@ -907,7 +907,7 @@
             <w:noProof/>
             <w:webHidden/>
           </w:rPr>
-          <w:instrText xml:space="preserve"> PAGEREF _Toc231300406 \h </w:instrText>
+          <w:instrText xml:space="preserve"> PAGEREF _Toc231381890 \h </w:instrText>
         </w:r>
         <w:r>
           <w:rPr>
@@ -948,7 +948,7 @@
           <w:noProof/>
         </w:rPr>
       </w:pPr>
-      <w:hyperlink w:anchor="_Toc231300407" w:history="1">
+      <w:hyperlink w:anchor="_Toc231381891" w:history="1">
         <w:r>
           <w:rPr>
             <w:rStyle w:val="Hyperlink"/>
@@ -975,7 +975,7 @@
             <w:noProof/>
             <w:webHidden/>
           </w:rPr>
-          <w:instrText xml:space="preserve"> PAGEREF _Toc231300407 \h </w:instrText>
+          <w:instrText xml:space="preserve"> PAGEREF _Toc231381891 \h </w:instrText>
         </w:r>
         <w:r>
           <w:rPr>
@@ -1016,7 +1016,7 @@
           <w:noProof/>
         </w:rPr>
       </w:pPr>
-      <w:hyperlink w:anchor="_Toc231300408" w:history="1">
+      <w:hyperlink w:anchor="_Toc231381892" w:history="1">
         <w:r>
           <w:rPr>
             <w:rStyle w:val="Hyperlink"/>
@@ -1043,7 +1043,7 @@
             <w:noProof/>
             <w:webHidden/>
           </w:rPr>
-          <w:instrText xml:space="preserve"> PAGEREF _Toc231300408 \h </w:instrText>
+          <w:instrText xml:space="preserve"> PAGEREF _Toc231381892 \h </w:instrText>
         </w:r>
         <w:r>
           <w:rPr>
@@ -1084,7 +1084,7 @@
           <w:noProof/>
         </w:rPr>
       </w:pPr>
-      <w:hyperlink w:anchor="_Toc231300409" w:history="1">
+      <w:hyperlink w:anchor="_Toc231381893" w:history="1">
         <w:r>
           <w:rPr>
             <w:rStyle w:val="Hyperlink"/>
@@ -1111,7 +1111,7 @@
             <w:noProof/>
             <w:webHidden/>
           </w:rPr>
-          <w:instrText xml:space="preserve"> PAGEREF _Toc231300409 \h </w:instrText>
+          <w:instrText xml:space="preserve"> PAGEREF _Toc231381893 \h </w:instrText>
         </w:r>
         <w:r>
           <w:rPr>
@@ -1152,7 +1152,7 @@
           <w:noProof/>
         </w:rPr>
       </w:pPr>
-      <w:hyperlink w:anchor="_Toc231300410" w:history="1">
+      <w:hyperlink w:anchor="_Toc231381894" w:history="1">
         <w:r>
           <w:rPr>
             <w:rStyle w:val="Hyperlink"/>
@@ -1179,7 +1179,7 @@
             <w:noProof/>
             <w:webHidden/>
           </w:rPr>
-          <w:instrText xml:space="preserve"> PAGEREF _Toc231300410 \h </w:instrText>
+          <w:instrText xml:space="preserve"> PAGEREF _Toc231381894 \h </w:instrText>
         </w:r>
         <w:r>
           <w:rPr>
@@ -1220,7 +1220,7 @@
           <w:noProof/>
         </w:rPr>
       </w:pPr>
-      <w:hyperlink w:anchor="_Toc231300411" w:history="1">
+      <w:hyperlink w:anchor="_Toc231381895" w:history="1">
         <w:r>
           <w:rPr>
             <w:rStyle w:val="Hyperlink"/>
@@ -1247,7 +1247,7 @@
             <w:noProof/>
             <w:webHidden/>
           </w:rPr>
-          <w:instrText xml:space="preserve"> PAGEREF _Toc231300411 \h </w:instrText>
+          <w:instrText xml:space="preserve"> PAGEREF _Toc231381895 \h </w:instrText>
         </w:r>
         <w:r>
           <w:rPr>
@@ -1288,7 +1288,7 @@
           <w:noProof/>
         </w:rPr>
       </w:pPr>
-      <w:hyperlink w:anchor="_Toc231300412" w:history="1">
+      <w:hyperlink w:anchor="_Toc231381896" w:history="1">
         <w:r>
           <w:rPr>
             <w:rStyle w:val="Hyperlink"/>
@@ -1315,7 +1315,7 @@
             <w:noProof/>
             <w:webHidden/>
           </w:rPr>
-          <w:instrText xml:space="preserve"> PAGEREF _Toc231300412 \h </w:instrText>
+          <w:instrText xml:space="preserve"> PAGEREF _Toc231381896 \h </w:instrText>
         </w:r>
         <w:r>
           <w:rPr>
@@ -1356,7 +1356,7 @@
           <w:noProof/>
         </w:rPr>
       </w:pPr>
-      <w:hyperlink w:anchor="_Toc231300413" w:history="1">
+      <w:hyperlink w:anchor="_Toc231381897" w:history="1">
         <w:r>
           <w:rPr>
             <w:rStyle w:val="Hyperlink"/>
@@ -1383,7 +1383,7 @@
             <w:noProof/>
             <w:webHidden/>
           </w:rPr>
-          <w:instrText xml:space="preserve"> PAGEREF _Toc231300413 \h </w:instrText>
+          <w:instrText xml:space="preserve"> PAGEREF _Toc231381897 \h </w:instrText>
         </w:r>
         <w:r>
           <w:rPr>
@@ -1403,7 +1403,7 @@
             <w:noProof/>
             <w:webHidden/>
           </w:rPr>
-          <w:t>5</w:t>
+          <w:t>6</w:t>
         </w:r>
         <w:r>
           <w:rPr>
@@ -1424,7 +1424,7 @@
           <w:noProof/>
         </w:rPr>
       </w:pPr>
-      <w:hyperlink w:anchor="_Toc231300414" w:history="1">
+      <w:hyperlink w:anchor="_Toc231381898" w:history="1">
         <w:r>
           <w:rPr>
             <w:rStyle w:val="Hyperlink"/>
@@ -1451,7 +1451,7 @@
             <w:noProof/>
             <w:webHidden/>
           </w:rPr>
-          <w:instrText xml:space="preserve"> PAGEREF _Toc231300414 \h </w:instrText>
+          <w:instrText xml:space="preserve"> PAGEREF _Toc231381898 \h </w:instrText>
         </w:r>
         <w:r>
           <w:rPr>
@@ -1492,7 +1492,7 @@
           <w:noProof/>
         </w:rPr>
       </w:pPr>
-      <w:hyperlink w:anchor="_Toc231300415" w:history="1">
+      <w:hyperlink w:anchor="_Toc231381899" w:history="1">
         <w:r>
           <w:rPr>
             <w:rStyle w:val="Hyperlink"/>
@@ -1519,7 +1519,7 @@
             <w:noProof/>
             <w:webHidden/>
           </w:rPr>
-          <w:instrText xml:space="preserve"> PAGEREF _Toc231300415 \h </w:instrText>
+          <w:instrText xml:space="preserve"> PAGEREF _Toc231381899 \h </w:instrText>
         </w:r>
         <w:r>
           <w:rPr>
@@ -1560,7 +1560,7 @@
           <w:noProof/>
         </w:rPr>
       </w:pPr>
-      <w:hyperlink w:anchor="_Toc231300416" w:history="1">
+      <w:hyperlink w:anchor="_Toc231381900" w:history="1">
         <w:r>
           <w:rPr>
             <w:rStyle w:val="Hyperlink"/>
@@ -1587,7 +1587,7 @@
             <w:noProof/>
             <w:webHidden/>
           </w:rPr>
-          <w:instrText xml:space="preserve"> PAGEREF _Toc231300416 \h </w:instrText>
+          <w:instrText xml:space="preserve"> PAGEREF _Toc231381900 \h </w:instrText>
         </w:r>
         <w:r>
           <w:rPr>
@@ -1607,7 +1607,7 @@
             <w:noProof/>
             <w:webHidden/>
           </w:rPr>
-          <w:t>6</w:t>
+          <w:t>7</w:t>
         </w:r>
         <w:r>
           <w:rPr>
@@ -1628,7 +1628,7 @@
           <w:noProof/>
         </w:rPr>
       </w:pPr>
-      <w:hyperlink w:anchor="_Toc231300417" w:history="1">
+      <w:hyperlink w:anchor="_Toc231381901" w:history="1">
         <w:r>
           <w:rPr>
             <w:rStyle w:val="Hyperlink"/>
@@ -1655,7 +1655,7 @@
             <w:noProof/>
             <w:webHidden/>
           </w:rPr>
-          <w:instrText xml:space="preserve"> PAGEREF _Toc231300417 \h </w:instrText>
+          <w:instrText xml:space="preserve"> PAGEREF _Toc231381901 \h </w:instrText>
         </w:r>
         <w:r>
           <w:rPr>
@@ -1675,7 +1675,7 @@
             <w:noProof/>
             <w:webHidden/>
           </w:rPr>
-          <w:t>6</w:t>
+          <w:t>7</w:t>
         </w:r>
         <w:r>
           <w:rPr>
@@ -1696,7 +1696,7 @@
           <w:noProof/>
         </w:rPr>
       </w:pPr>
-      <w:hyperlink w:anchor="_Toc231300418" w:history="1">
+      <w:hyperlink w:anchor="_Toc231381902" w:history="1">
         <w:r>
           <w:rPr>
             <w:rStyle w:val="Hyperlink"/>
@@ -1723,7 +1723,7 @@
             <w:noProof/>
             <w:webHidden/>
           </w:rPr>
-          <w:instrText xml:space="preserve"> PAGEREF _Toc231300418 \h </w:instrText>
+          <w:instrText xml:space="preserve"> PAGEREF _Toc231381902 \h </w:instrText>
         </w:r>
         <w:r>
           <w:rPr>
@@ -1764,7 +1764,7 @@
           <w:noProof/>
         </w:rPr>
       </w:pPr>
-      <w:hyperlink w:anchor="_Toc231300419" w:history="1">
+      <w:hyperlink w:anchor="_Toc231381903" w:history="1">
         <w:r>
           <w:rPr>
             <w:rStyle w:val="Hyperlink"/>
@@ -1791,7 +1791,7 @@
             <w:noProof/>
             <w:webHidden/>
           </w:rPr>
-          <w:instrText xml:space="preserve"> PAGEREF _Toc231300419 \h </w:instrText>
+          <w:instrText xml:space="preserve"> PAGEREF _Toc231381903 \h </w:instrText>
         </w:r>
         <w:r>
           <w:rPr>
@@ -1811,7 +1811,7 @@
             <w:noProof/>
             <w:webHidden/>
           </w:rPr>
-          <w:t>7</w:t>
+          <w:t>8</w:t>
         </w:r>
         <w:r>
           <w:rPr>
@@ -1832,7 +1832,7 @@
           <w:noProof/>
         </w:rPr>
       </w:pPr>
-      <w:hyperlink w:anchor="_Toc231300420" w:history="1">
+      <w:hyperlink w:anchor="_Toc231381904" w:history="1">
         <w:r>
           <w:rPr>
             <w:rStyle w:val="Hyperlink"/>
@@ -1859,7 +1859,7 @@
             <w:noProof/>
             <w:webHidden/>
           </w:rPr>
-          <w:instrText xml:space="preserve"> PAGEREF _Toc231300420 \h </w:instrText>
+          <w:instrText xml:space="preserve"> PAGEREF _Toc231381904 \h </w:instrText>
         </w:r>
         <w:r>
           <w:rPr>
@@ -1879,7 +1879,7 @@
             <w:noProof/>
             <w:webHidden/>
           </w:rPr>
-          <w:t>7</w:t>
+          <w:t>8</w:t>
         </w:r>
         <w:r>
           <w:rPr>
@@ -1900,7 +1900,7 @@
           <w:noProof/>
         </w:rPr>
       </w:pPr>
-      <w:hyperlink w:anchor="_Toc231300421" w:history="1">
+      <w:hyperlink w:anchor="_Toc231381905" w:history="1">
         <w:r>
           <w:rPr>
             <w:rStyle w:val="Hyperlink"/>
@@ -1927,7 +1927,7 @@
             <w:noProof/>
             <w:webHidden/>
           </w:rPr>
-          <w:instrText xml:space="preserve"> PAGEREF _Toc231300421 \h </w:instrText>
+          <w:instrText xml:space="preserve"> PAGEREF _Toc231381905 \h </w:instrText>
         </w:r>
         <w:r>
           <w:rPr>
@@ -1968,7 +1968,7 @@
           <w:noProof/>
         </w:rPr>
       </w:pPr>
-      <w:hyperlink w:anchor="_Toc231300422" w:history="1">
+      <w:hyperlink w:anchor="_Toc231381906" w:history="1">
         <w:r>
           <w:rPr>
             <w:rStyle w:val="Hyperlink"/>
@@ -1995,7 +1995,7 @@
             <w:noProof/>
             <w:webHidden/>
           </w:rPr>
-          <w:instrText xml:space="preserve"> PAGEREF _Toc231300422 \h </w:instrText>
+          <w:instrText xml:space="preserve"> PAGEREF _Toc231381906 \h </w:instrText>
         </w:r>
         <w:r>
           <w:rPr>
@@ -2036,7 +2036,7 @@
           <w:noProof/>
         </w:rPr>
       </w:pPr>
-      <w:hyperlink w:anchor="_Toc231300423" w:history="1">
+      <w:hyperlink w:anchor="_Toc231381907" w:history="1">
         <w:r>
           <w:rPr>
             <w:rStyle w:val="Hyperlink"/>
@@ -2063,7 +2063,7 @@
             <w:noProof/>
             <w:webHidden/>
           </w:rPr>
-          <w:instrText xml:space="preserve"> PAGEREF _Toc231300423 \h </w:instrText>
+          <w:instrText xml:space="preserve"> PAGEREF _Toc231381907 \h </w:instrText>
         </w:r>
         <w:r>
           <w:rPr>
@@ -2104,7 +2104,7 @@
           <w:noProof/>
         </w:rPr>
       </w:pPr>
-      <w:hyperlink w:anchor="_Toc231300424" w:history="1">
+      <w:hyperlink w:anchor="_Toc231381908" w:history="1">
         <w:r>
           <w:rPr>
             <w:rStyle w:val="Hyperlink"/>
@@ -2131,7 +2131,7 @@
             <w:noProof/>
             <w:webHidden/>
           </w:rPr>
-          <w:instrText xml:space="preserve"> PAGEREF _Toc231300424 \h </w:instrText>
+          <w:instrText xml:space="preserve"> PAGEREF _Toc231381908 \h </w:instrText>
         </w:r>
         <w:r>
           <w:rPr>
@@ -2172,7 +2172,7 @@
           <w:noProof/>
         </w:rPr>
       </w:pPr>
-      <w:hyperlink w:anchor="_Toc231300425" w:history="1">
+      <w:hyperlink w:anchor="_Toc231381909" w:history="1">
         <w:r>
           <w:rPr>
             <w:rStyle w:val="Hyperlink"/>
@@ -2199,7 +2199,7 @@
             <w:noProof/>
             <w:webHidden/>
           </w:rPr>
-          <w:instrText xml:space="preserve"> PAGEREF _Toc231300425 \h </w:instrText>
+          <w:instrText xml:space="preserve"> PAGEREF _Toc231381909 \h </w:instrText>
         </w:r>
         <w:r>
           <w:rPr>
@@ -2219,7 +2219,7 @@
             <w:noProof/>
             <w:webHidden/>
           </w:rPr>
-          <w:t>8</w:t>
+          <w:t>9</w:t>
         </w:r>
         <w:r>
           <w:rPr>
@@ -2240,7 +2240,7 @@
           <w:noProof/>
         </w:rPr>
       </w:pPr>
-      <w:hyperlink w:anchor="_Toc231300426" w:history="1">
+      <w:hyperlink w:anchor="_Toc231381910" w:history="1">
         <w:r>
           <w:rPr>
             <w:rStyle w:val="Hyperlink"/>
@@ -2267,7 +2267,7 @@
             <w:noProof/>
             <w:webHidden/>
           </w:rPr>
-          <w:instrText xml:space="preserve"> PAGEREF _Toc231300426 \h </w:instrText>
+          <w:instrText xml:space="preserve"> PAGEREF _Toc231381910 \h </w:instrText>
         </w:r>
         <w:r>
           <w:rPr>
@@ -2287,7 +2287,7 @@
             <w:noProof/>
             <w:webHidden/>
           </w:rPr>
-          <w:t>8</w:t>
+          <w:t>9</w:t>
         </w:r>
         <w:r>
           <w:rPr>
@@ -2308,7 +2308,7 @@
           <w:noProof/>
         </w:rPr>
       </w:pPr>
-      <w:hyperlink w:anchor="_Toc231300427" w:history="1">
+      <w:hyperlink w:anchor="_Toc231381911" w:history="1">
         <w:r>
           <w:rPr>
             <w:rStyle w:val="Hyperlink"/>
@@ -2335,7 +2335,7 @@
             <w:noProof/>
             <w:webHidden/>
           </w:rPr>
-          <w:instrText xml:space="preserve"> PAGEREF _Toc231300427 \h </w:instrText>
+          <w:instrText xml:space="preserve"> PAGEREF _Toc231381911 \h </w:instrText>
         </w:r>
         <w:r>
           <w:rPr>
@@ -2376,7 +2376,7 @@
           <w:noProof/>
         </w:rPr>
       </w:pPr>
-      <w:hyperlink w:anchor="_Toc231300428" w:history="1">
+      <w:hyperlink w:anchor="_Toc231381912" w:history="1">
         <w:r>
           <w:rPr>
             <w:rStyle w:val="Hyperlink"/>
@@ -2403,7 +2403,7 @@
             <w:noProof/>
             <w:webHidden/>
           </w:rPr>
-          <w:instrText xml:space="preserve"> PAGEREF _Toc231300428 \h </w:instrText>
+          <w:instrText xml:space="preserve"> PAGEREF _Toc231381912 \h </w:instrText>
         </w:r>
         <w:r>
           <w:rPr>
@@ -2444,7 +2444,7 @@
           <w:noProof/>
         </w:rPr>
       </w:pPr>
-      <w:hyperlink w:anchor="_Toc231300429" w:history="1">
+      <w:hyperlink w:anchor="_Toc231381913" w:history="1">
         <w:r>
           <w:rPr>
             <w:rStyle w:val="Hyperlink"/>
@@ -2471,7 +2471,7 @@
             <w:noProof/>
             <w:webHidden/>
           </w:rPr>
-          <w:instrText xml:space="preserve"> PAGEREF _Toc231300429 \h </w:instrText>
+          <w:instrText xml:space="preserve"> PAGEREF _Toc231381913 \h </w:instrText>
         </w:r>
         <w:r>
           <w:rPr>
@@ -2491,7 +2491,7 @@
             <w:noProof/>
             <w:webHidden/>
           </w:rPr>
-          <w:t>9</w:t>
+          <w:t>10</w:t>
         </w:r>
         <w:r>
           <w:rPr>
@@ -2523,7 +2523,7 @@
       <w:pPr>
         <w:pStyle w:val="Heading1"/>
       </w:pPr>
-      <w:bookmarkStart w:id="1" w:name="_Toc231300400"/>
+      <w:bookmarkStart w:id="1" w:name="_Toc231381884"/>
       <w:r>
         <w:lastRenderedPageBreak/>
         <w:t>1. Purpose and Scope</w:t>
@@ -2539,7 +2539,7 @@
       <w:pPr>
         <w:pStyle w:val="Heading3"/>
       </w:pPr>
-      <w:bookmarkStart w:id="2" w:name="_Toc231300401"/>
+      <w:bookmarkStart w:id="2" w:name="_Toc231381885"/>
       <w:r>
         <w:t>In scope of this design</w:t>
       </w:r>
@@ -2573,7 +2573,7 @@
       <w:pPr>
         <w:pStyle w:val="Heading3"/>
       </w:pPr>
-      <w:bookmarkStart w:id="3" w:name="_Toc231300402"/>
+      <w:bookmarkStart w:id="3" w:name="_Toc231381886"/>
       <w:r>
         <w:t>Out of scope — deferred to the follow-on HA design phase</w:t>
       </w:r>
@@ -2607,7 +2607,7 @@
       <w:pPr>
         <w:pStyle w:val="Heading3"/>
       </w:pPr>
-      <w:bookmarkStart w:id="4" w:name="_Toc231300403"/>
+      <w:bookmarkStart w:id="4" w:name="_Toc231381887"/>
       <w:r>
         <w:t>Out of MTS scope entirely — YAT ICT responsibility</w:t>
       </w:r>
@@ -2649,7 +2649,7 @@
       <w:pPr>
         <w:pStyle w:val="Heading1"/>
       </w:pPr>
-      <w:bookmarkStart w:id="5" w:name="_Toc231300404"/>
+      <w:bookmarkStart w:id="5" w:name="_Toc231381888"/>
       <w:r>
         <w:t>2. Design Inputs and Requirements</w:t>
       </w:r>
@@ -2659,7 +2659,7 @@
       <w:pPr>
         <w:pStyle w:val="Heading3"/>
       </w:pPr>
-      <w:bookmarkStart w:id="6" w:name="_Toc231300405"/>
+      <w:bookmarkStart w:id="6" w:name="_Toc231381889"/>
       <w:r>
         <w:t>2.1 Inputs</w:t>
       </w:r>
@@ -2701,7 +2701,7 @@
       <w:pPr>
         <w:pStyle w:val="Heading3"/>
       </w:pPr>
-      <w:bookmarkStart w:id="7" w:name="_Toc231300406"/>
+      <w:bookmarkStart w:id="7" w:name="_Toc231381890"/>
       <w:r>
         <w:t>2.2 Requirements the design must meet</w:t>
       </w:r>
@@ -3213,7 +3213,7 @@
       <w:pPr>
         <w:pStyle w:val="Heading1"/>
       </w:pPr>
-      <w:bookmarkStart w:id="8" w:name="_Toc231300407"/>
+      <w:bookmarkStart w:id="8" w:name="_Toc231381891"/>
       <w:r>
         <w:t>3. Review of Existing Architecture</w:t>
       </w:r>
@@ -3232,7 +3232,7 @@
       <w:pPr>
         <w:pStyle w:val="Heading1"/>
       </w:pPr>
-      <w:bookmarkStart w:id="9" w:name="_Toc231300408"/>
+      <w:bookmarkStart w:id="9" w:name="_Toc231381892"/>
       <w:r>
         <w:t>4. Architecture Design</w:t>
       </w:r>
@@ -3242,7 +3242,7 @@
       <w:pPr>
         <w:pStyle w:val="Heading3"/>
       </w:pPr>
-      <w:bookmarkStart w:id="10" w:name="_Toc231300409"/>
+      <w:bookmarkStart w:id="10" w:name="_Toc231381893"/>
       <w:r>
         <w:t>4.1 Assumptions and constraints</w:t>
       </w:r>
@@ -3777,7 +3777,7 @@
       <w:pPr>
         <w:pStyle w:val="Heading3"/>
       </w:pPr>
-      <w:bookmarkStart w:id="11" w:name="_Toc231300410"/>
+      <w:bookmarkStart w:id="11" w:name="_Toc231381894"/>
       <w:r>
         <w:t>4.2 AWS account and region</w:t>
       </w:r>
@@ -3796,7 +3796,7 @@
       <w:pPr>
         <w:pStyle w:val="Heading3"/>
       </w:pPr>
-      <w:bookmarkStart w:id="12" w:name="_Toc231300411"/>
+      <w:bookmarkStart w:id="12" w:name="_Toc231381895"/>
       <w:r>
         <w:t>4.3 Identity and Access Management (IAM)</w:t>
       </w:r>
@@ -4166,7 +4166,7 @@
       <w:pPr>
         <w:pStyle w:val="Heading3"/>
       </w:pPr>
-      <w:bookmarkStart w:id="13" w:name="_Toc231300412"/>
+      <w:bookmarkStart w:id="13" w:name="_Toc231381896"/>
       <w:r>
         <w:t>4.4 Network topology</w:t>
       </w:r>
@@ -4562,11 +4562,131 @@
         <w:t>The follow-on HA design adds the corresponding -b subnets in ap-southeast-2b.</w:t>
       </w:r>
     </w:p>
+    <w:tbl>
+      <w:tblPr>
+        <w:tblW w:w="0" w:type="auto"/>
+        <w:tblInd w:w="563" w:type="dxa"/>
+        <w:tblLook w:val="04A0" w:firstRow="1" w:lastRow="0" w:firstColumn="1" w:lastColumn="0" w:noHBand="0" w:noVBand="1"/>
+      </w:tblPr>
+      <w:tblGrid>
+        <w:gridCol w:w="8286"/>
+      </w:tblGrid>
+      <w:tr>
+        <w:trPr>
+          <w:trHeight w:hRule="exact" w:val="5386"/>
+        </w:trPr>
+        <w:tc>
+          <w:tcPr>
+            <w:tcW w:w="8286" w:type="dxa"/>
+            <w:tcBorders>
+              <w:top w:val="single" w:sz="4" w:space="0" w:color="E4DED3"/>
+              <w:left w:val="single" w:sz="4" w:space="0" w:color="E4DED3"/>
+              <w:bottom w:val="single" w:sz="4" w:space="0" w:color="E4DED3"/>
+              <w:right w:val="single" w:sz="4" w:space="0" w:color="E4DED3"/>
+            </w:tcBorders>
+            <w:shd w:val="clear" w:color="auto" w:fill="F8F4ED"/>
+            <w:vAlign w:val="center"/>
+          </w:tcPr>
+          <w:p>
+            <w:pPr>
+              <w:jc w:val="center"/>
+            </w:pPr>
+            <w:r>
+              <w:lastRenderedPageBreak/>
+              <w:drawing>
+                <wp:inline distT="0" distB="0" distL="0" distR="0" wp14:anchorId="1A085BAC" wp14:editId="06F46B72">
+                  <wp:extent cx="5115464" cy="3411578"/>
+                  <wp:effectExtent l="0" t="0" r="9525" b="0"/>
+                  <wp:docPr id="78085173" name="Graphic 1"/>
+                  <wp:cNvGraphicFramePr>
+                    <a:graphicFrameLocks xmlns:a="http://schemas.openxmlformats.org/drawingml/2006/main" noChangeAspect="1"/>
+                  </wp:cNvGraphicFramePr>
+                  <a:graphic xmlns:a="http://schemas.openxmlformats.org/drawingml/2006/main">
+                    <a:graphicData uri="http://schemas.openxmlformats.org/drawingml/2006/picture">
+                      <pic:pic xmlns:pic="http://schemas.openxmlformats.org/drawingml/2006/picture">
+                        <pic:nvPicPr>
+                          <pic:cNvPr id="78085173" name=""/>
+                          <pic:cNvPicPr/>
+                        </pic:nvPicPr>
+                        <pic:blipFill>
+                          <a:blip r:embed="rId12">
+                            <a:extLst>
+                              <a:ext uri="{96DAC541-7B7A-43D3-8B79-37D633B846F1}">
+                                <asvg:svgBlip xmlns:asvg="http://schemas.microsoft.com/office/drawing/2016/SVG/main" r:embed="rId13"/>
+                              </a:ext>
+                            </a:extLst>
+                          </a:blip>
+                          <a:stretch>
+                            <a:fillRect/>
+                          </a:stretch>
+                        </pic:blipFill>
+                        <pic:spPr>
+                          <a:xfrm>
+                            <a:off x="0" y="0"/>
+                            <a:ext cx="5147413" cy="3432886"/>
+                          </a:xfrm>
+                          <a:prstGeom prst="rect">
+                            <a:avLst/>
+                          </a:prstGeom>
+                        </pic:spPr>
+                      </pic:pic>
+                    </a:graphicData>
+                  </a:graphic>
+                </wp:inline>
+              </w:drawing>
+            </w:r>
+          </w:p>
+        </w:tc>
+      </w:tr>
+    </w:tbl>
+    <w:p>
+      <w:pPr>
+        <w:rPr>
+          <w:i/>
+          <w:color w:val="6B6660"/>
+          <w:sz w:val="18"/>
+        </w:rPr>
+      </w:pPr>
+      <w:r>
+        <w:rPr>
+          <w:i/>
+          <w:color w:val="6B6660"/>
+          <w:sz w:val="18"/>
+        </w:rPr>
+        <w:t xml:space="preserve">               </w:t>
+      </w:r>
+      <w:r>
+        <w:rPr>
+          <w:i/>
+          <w:color w:val="6B6660"/>
+          <w:sz w:val="18"/>
+        </w:rPr>
+        <w:t xml:space="preserve">Figure 4.4 — </w:t>
+      </w:r>
+      <w:proofErr w:type="spellStart"/>
+      <w:r>
+        <w:rPr>
+          <w:i/>
+          <w:color w:val="6B6660"/>
+          <w:sz w:val="18"/>
+        </w:rPr>
+        <w:t>Ledgerline</w:t>
+      </w:r>
+      <w:proofErr w:type="spellEnd"/>
+      <w:r>
+        <w:rPr>
+          <w:i/>
+          <w:color w:val="6B6660"/>
+          <w:sz w:val="18"/>
+        </w:rPr>
+        <w:t xml:space="preserve"> baseline network topology (single-AZ, internal / staff-only over the campus VPN).</w:t>
+      </w:r>
+    </w:p>
     <w:p>
       <w:pPr>
         <w:pStyle w:val="Heading3"/>
       </w:pPr>
-      <w:bookmarkStart w:id="14" w:name="_Toc231300413"/>
+      <w:bookmarkStart w:id="14" w:name="_Toc231381897"/>
       <w:r>
         <w:t>4.5 Compute (EC2 + Auto Scaling)</w:t>
       </w:r>
@@ -4601,7 +4721,6 @@
         <w:pStyle w:val="ListBullet"/>
       </w:pPr>
       <w:r>
-        <w:lastRenderedPageBreak/>
         <w:t>The workload is business-hours and idle overnight; the follow-on HA design adds cross-AZ capacity for resilience (not for load).</w:t>
       </w:r>
     </w:p>
@@ -4609,7 +4728,7 @@
       <w:pPr>
         <w:pStyle w:val="Heading3"/>
       </w:pPr>
-      <w:bookmarkStart w:id="15" w:name="_Toc231300414"/>
+      <w:bookmarkStart w:id="15" w:name="_Toc231381898"/>
       <w:r>
         <w:t>4.6 Load balancing (ALB)</w:t>
       </w:r>
@@ -4643,7 +4762,7 @@
       <w:pPr>
         <w:pStyle w:val="Heading3"/>
       </w:pPr>
-      <w:bookmarkStart w:id="16" w:name="_Toc231300415"/>
+      <w:bookmarkStart w:id="16" w:name="_Toc231381899"/>
       <w:r>
         <w:t>4.7 Database (RDS for SQL Server)</w:t>
       </w:r>
@@ -4694,6 +4813,7 @@
         <w:pStyle w:val="ListBullet"/>
       </w:pPr>
       <w:r>
+        <w:lastRenderedPageBreak/>
         <w:t>Schema and data migration are YAT ICT's responsibility, not MTS's — MTS provisions an empty instance.</w:t>
       </w:r>
     </w:p>
@@ -4701,7 +4821,7 @@
       <w:pPr>
         <w:pStyle w:val="Heading3"/>
       </w:pPr>
-      <w:bookmarkStart w:id="17" w:name="_Toc231300416"/>
+      <w:bookmarkStart w:id="17" w:name="_Toc231381900"/>
       <w:r>
         <w:t>4.8 Storage</w:t>
       </w:r>
@@ -5055,7 +5175,7 @@
       <w:pPr>
         <w:pStyle w:val="Heading3"/>
       </w:pPr>
-      <w:bookmarkStart w:id="18" w:name="_Toc231300417"/>
+      <w:bookmarkStart w:id="18" w:name="_Toc231381901"/>
       <w:r>
         <w:t>4.9 Security</w:t>
       </w:r>
@@ -5339,7 +5459,6 @@
         <w:pStyle w:val="ListBullet"/>
       </w:pPr>
       <w:r>
-        <w:lastRenderedPageBreak/>
         <w:t>Encryption in transit: HTTPS staff→ALB→EC2; TLS EC2→RDS; AWS calls over TLS via VPC endpoints where available; LDAPS and SFTP for external links.</w:t>
       </w:r>
     </w:p>
@@ -5363,7 +5482,7 @@
       <w:pPr>
         <w:pStyle w:val="Heading3"/>
       </w:pPr>
-      <w:bookmarkStart w:id="19" w:name="_Toc231300418"/>
+      <w:bookmarkStart w:id="19" w:name="_Toc231381902"/>
       <w:r>
         <w:t>4.10 Monitoring (baseline)</w:t>
       </w:r>
@@ -5663,6 +5782,7 @@
         <w:pStyle w:val="ListBullet"/>
       </w:pPr>
       <w:r>
+        <w:lastRenderedPageBreak/>
         <w:t>Logging: VPC flow logs and RDS logs → CloudWatch Logs; ALB access logs → S3; EC2 OS logs via the CloudWatch Agent. Financial-audit-relevant logs retained to meet the 7-year obligation.</w:t>
       </w:r>
     </w:p>
@@ -5670,7 +5790,7 @@
       <w:pPr>
         <w:pStyle w:val="Heading3"/>
       </w:pPr>
-      <w:bookmarkStart w:id="20" w:name="_Toc231300419"/>
+      <w:bookmarkStart w:id="20" w:name="_Toc231381903"/>
       <w:r>
         <w:t>4.11 Naming and tagging conventions</w:t>
       </w:r>
@@ -6010,7 +6130,7 @@
       <w:pPr>
         <w:pStyle w:val="Heading3"/>
       </w:pPr>
-      <w:bookmarkStart w:id="21" w:name="_Toc231300420"/>
+      <w:bookmarkStart w:id="21" w:name="_Toc231381904"/>
       <w:r>
         <w:t>4.12 Backup</w:t>
       </w:r>
@@ -6301,9 +6421,8 @@
       <w:pPr>
         <w:pStyle w:val="Heading3"/>
       </w:pPr>
-      <w:bookmarkStart w:id="22" w:name="_Toc231300421"/>
+      <w:bookmarkStart w:id="22" w:name="_Toc231381905"/>
       <w:r>
-        <w:lastRenderedPageBreak/>
         <w:t>4.13 Recovery objectives — baseline state</w:t>
       </w:r>
       <w:bookmarkEnd w:id="22"/>
@@ -6317,7 +6436,7 @@
       <w:pPr>
         <w:pStyle w:val="Heading3"/>
       </w:pPr>
-      <w:bookmarkStart w:id="23" w:name="_Toc231300422"/>
+      <w:bookmarkStart w:id="23" w:name="_Toc231381906"/>
       <w:r>
         <w:t>4.14 Components requiring vertical scaling</w:t>
       </w:r>
@@ -6332,7 +6451,7 @@
       <w:pPr>
         <w:pStyle w:val="Heading3"/>
       </w:pPr>
-      <w:bookmarkStart w:id="24" w:name="_Toc231300423"/>
+      <w:bookmarkStart w:id="24" w:name="_Toc231381907"/>
       <w:r>
         <w:t>4.15 Single points of failure removed</w:t>
       </w:r>
@@ -6351,7 +6470,7 @@
       <w:pPr>
         <w:pStyle w:val="Heading3"/>
       </w:pPr>
-      <w:bookmarkStart w:id="25" w:name="_Toc231300424"/>
+      <w:bookmarkStart w:id="25" w:name="_Toc231381908"/>
       <w:r>
         <w:t>4.16 Configuration decisions left to the implementer</w:t>
       </w:r>
@@ -6464,6 +6583,7 @@
                 <w:b/>
                 <w:sz w:val="18"/>
               </w:rPr>
+              <w:lastRenderedPageBreak/>
               <w:t>C1</w:t>
             </w:r>
           </w:p>
@@ -6954,7 +7074,7 @@
       <w:pPr>
         <w:pStyle w:val="Heading1"/>
       </w:pPr>
-      <w:bookmarkStart w:id="26" w:name="_Toc231300425"/>
+      <w:bookmarkStart w:id="26" w:name="_Toc231381909"/>
       <w:r>
         <w:t>5. Implementation Sequencing</w:t>
       </w:r>
@@ -6973,7 +7093,7 @@
       <w:pPr>
         <w:pStyle w:val="Heading1"/>
       </w:pPr>
-      <w:bookmarkStart w:id="27" w:name="_Toc231300426"/>
+      <w:bookmarkStart w:id="27" w:name="_Toc231381910"/>
       <w:r>
         <w:t>6. Simulation and Verification Plan</w:t>
       </w:r>
@@ -6992,9 +7112,8 @@
       <w:pPr>
         <w:pStyle w:val="Heading1"/>
       </w:pPr>
-      <w:bookmarkStart w:id="28" w:name="_Toc231300427"/>
+      <w:bookmarkStart w:id="28" w:name="_Toc231381911"/>
       <w:r>
-        <w:lastRenderedPageBreak/>
         <w:t>7. Out of Scope</w:t>
       </w:r>
       <w:bookmarkEnd w:id="28"/>
@@ -7040,7 +7159,7 @@
       <w:pPr>
         <w:pStyle w:val="Heading1"/>
       </w:pPr>
-      <w:bookmarkStart w:id="29" w:name="_Toc231300428"/>
+      <w:bookmarkStart w:id="29" w:name="_Toc231381912"/>
       <w:r>
         <w:t>8. References</w:t>
       </w:r>
@@ -7074,8 +7193,9 @@
       <w:pPr>
         <w:pStyle w:val="Heading1"/>
       </w:pPr>
-      <w:bookmarkStart w:id="30" w:name="_Toc231300429"/>
+      <w:bookmarkStart w:id="30" w:name="_Toc231381913"/>
       <w:r>
+        <w:lastRenderedPageBreak/>
         <w:t>Document control</w:t>
       </w:r>
       <w:bookmarkEnd w:id="30"/>
@@ -7362,8 +7482,8 @@
     </w:tbl>
     <w:p/>
     <w:sectPr>
-      <w:headerReference w:type="default" r:id="rId12"/>
-      <w:footerReference w:type="default" r:id="rId13"/>
+      <w:headerReference w:type="default" r:id="rId14"/>
+      <w:footerReference w:type="default" r:id="rId15"/>
       <w:pgSz w:w="11906" w:h="16838"/>
       <w:pgMar w:top="1474" w:right="1247" w:bottom="1247" w:left="1247" w:header="567" w:footer="567" w:gutter="0"/>
       <w:cols w:space="720"/>
@@ -7935,31 +8055,31 @@
       </w:rPr>
     </w:lvl>
   </w:abstractNum>
-  <w:num w:numId="1" w16cid:durableId="166017785">
+  <w:num w:numId="1" w16cid:durableId="1278830318">
     <w:abstractNumId w:val="8"/>
   </w:num>
-  <w:num w:numId="2" w16cid:durableId="1108812853">
+  <w:num w:numId="2" w16cid:durableId="2002007210">
     <w:abstractNumId w:val="6"/>
   </w:num>
-  <w:num w:numId="3" w16cid:durableId="1624843827">
+  <w:num w:numId="3" w16cid:durableId="429351905">
     <w:abstractNumId w:val="5"/>
   </w:num>
-  <w:num w:numId="4" w16cid:durableId="330453900">
+  <w:num w:numId="4" w16cid:durableId="1075781812">
     <w:abstractNumId w:val="4"/>
   </w:num>
-  <w:num w:numId="5" w16cid:durableId="113988864">
+  <w:num w:numId="5" w16cid:durableId="942302061">
     <w:abstractNumId w:val="7"/>
   </w:num>
-  <w:num w:numId="6" w16cid:durableId="1146045035">
+  <w:num w:numId="6" w16cid:durableId="559950491">
     <w:abstractNumId w:val="3"/>
   </w:num>
-  <w:num w:numId="7" w16cid:durableId="652636306">
+  <w:num w:numId="7" w16cid:durableId="1624075409">
     <w:abstractNumId w:val="2"/>
   </w:num>
-  <w:num w:numId="8" w16cid:durableId="423454279">
+  <w:num w:numId="8" w16cid:durableId="1506091806">
     <w:abstractNumId w:val="1"/>
   </w:num>
-  <w:num w:numId="9" w16cid:durableId="429006361">
+  <w:num w:numId="9" w16cid:durableId="710494019">
     <w:abstractNumId w:val="0"/>
   </w:num>
 </w:numbering>
@@ -19352,7 +19472,7 @@
     <w:autoRedefine/>
     <w:uiPriority w:val="39"/>
     <w:unhideWhenUsed/>
-    <w:rsid w:val="00BA0598"/>
+    <w:rsid w:val="007F1395"/>
     <w:pPr>
       <w:spacing w:after="100"/>
     </w:pPr>
@@ -19364,7 +19484,7 @@
     <w:autoRedefine/>
     <w:uiPriority w:val="39"/>
     <w:unhideWhenUsed/>
-    <w:rsid w:val="00BA0598"/>
+    <w:rsid w:val="007F1395"/>
     <w:pPr>
       <w:spacing w:after="100"/>
       <w:ind w:left="420"/>
@@ -19375,7 +19495,7 @@
     <w:basedOn w:val="DefaultParagraphFont"/>
     <w:uiPriority w:val="99"/>
     <w:unhideWhenUsed/>
-    <w:rsid w:val="00BA0598"/>
+    <w:rsid w:val="007F1395"/>
     <w:rPr>
       <w:color w:val="0000FF" w:themeColor="hyperlink"/>
       <w:u w:val="single"/>

</xml_diff>